<commit_message>
upload testing results and recording
</commit_message>
<xml_diff>
--- a/Documentation/Evaluation2/Results of testing_IP2.docx
+++ b/Documentation/Evaluation2/Results of testing_IP2.docx
@@ -303,7 +303,19 @@
         <w:rPr>
           <w:rFonts w:ascii="Aptos" w:hAnsi="Aptos"/>
         </w:rPr>
-        <w:t>Participants freely test all tools and share impressions aloud. (30s)</w:t>
+        <w:t>Participants freely test all tools and share impressions aloud. (</w:t>
+      </w:r>
+      <w:r>
+        <w:rPr>
+          <w:rFonts w:ascii="Aptos" w:hAnsi="Aptos"/>
+        </w:rPr>
+        <w:t>30</w:t>
+      </w:r>
+      <w:r>
+        <w:rPr>
+          <w:rFonts w:ascii="Aptos" w:hAnsi="Aptos"/>
+        </w:rPr>
+        <w:t>s)</w:t>
       </w:r>
     </w:p>
     <w:p>
@@ -428,16 +440,16 @@
           <w:p>
             <w:pPr>
               <w:jc w:val="center"/>
+            </w:pPr>
+            <w:r>
               <w:rPr>
                 <w:rFonts w:hint="eastAsia"/>
               </w:rPr>
-            </w:pPr>
-            <w:r>
-              <w:rPr>
-                <w:rFonts w:hint="eastAsia"/>
-              </w:rPr>
               <w:t>20</w:t>
             </w:r>
+            <w:r>
+              <w:t>s</w:t>
+            </w:r>
           </w:p>
         </w:tc>
         <w:tc>
@@ -457,7 +469,11 @@
           <w:tcPr>
             <w:tcW w:w="4059" w:type="dxa"/>
           </w:tcPr>
-          <w:p/>
+          <w:p>
+            <w:r>
+              <w:t>/</w:t>
+            </w:r>
+          </w:p>
         </w:tc>
       </w:tr>
       <w:tr>
@@ -482,23 +498,20 @@
           <w:p>
             <w:pPr>
               <w:jc w:val="center"/>
+            </w:pPr>
+            <w:r>
               <w:rPr>
                 <w:rFonts w:hint="eastAsia"/>
               </w:rPr>
-            </w:pPr>
+              <w:t>2</w:t>
+            </w:r>
+            <w:r>
+              <w:t>:</w:t>
+            </w:r>
             <w:r>
               <w:rPr>
                 <w:rFonts w:hint="eastAsia"/>
               </w:rPr>
-              <w:t>2</w:t>
-            </w:r>
-            <w:r>
-              <w:t>:</w:t>
-            </w:r>
-            <w:r>
-              <w:rPr>
-                <w:rFonts w:hint="eastAsia"/>
-              </w:rPr>
               <w:t>00</w:t>
             </w:r>
           </w:p>
@@ -521,11 +534,6 @@
             <w:tcW w:w="4059" w:type="dxa"/>
           </w:tcPr>
           <w:p>
-            <w:pPr>
-              <w:rPr>
-                <w:rFonts w:hint="eastAsia"/>
-              </w:rPr>
-            </w:pPr>
             <w:r>
               <w:rPr>
                 <w:rFonts w:ascii="Segoe UI" w:hAnsi="Segoe UI" w:cs="Segoe UI"/>
@@ -534,8 +542,62 @@
                 <w:szCs w:val="21"/>
                 <w:shd w:val="clear" w:color="auto" w:fill="FFFFFF"/>
               </w:rPr>
-              <w:t xml:space="preserve">When you grab it, the pen is so thick; </w:t>
-            </w:r>
+              <w:t>When you grab it, the pen is so thick; the pen is good, you can change the angle; the position of the pen can be adjusted; the pen is a bit far away on the drawing board, and it is a little difficult to control it</w:t>
+            </w:r>
+          </w:p>
+        </w:tc>
+      </w:tr>
+      <w:tr>
+        <w:tc>
+          <w:tcPr>
+            <w:tcW w:w="1129" w:type="dxa"/>
+          </w:tcPr>
+          <w:p>
+            <w:pPr>
+              <w:jc w:val="center"/>
+            </w:pPr>
+            <w:r>
+              <w:t>3</w:t>
+            </w:r>
+          </w:p>
+        </w:tc>
+        <w:tc>
+          <w:tcPr>
+            <w:tcW w:w="1985" w:type="dxa"/>
+          </w:tcPr>
+          <w:p>
+            <w:pPr>
+              <w:jc w:val="center"/>
+            </w:pPr>
+            <w:r>
+              <w:rPr>
+                <w:rFonts w:hint="eastAsia"/>
+              </w:rPr>
+              <w:t>25</w:t>
+            </w:r>
+            <w:r>
+              <w:t>s</w:t>
+            </w:r>
+          </w:p>
+        </w:tc>
+        <w:tc>
+          <w:tcPr>
+            <w:tcW w:w="1843" w:type="dxa"/>
+          </w:tcPr>
+          <w:p>
+            <w:pPr>
+              <w:jc w:val="center"/>
+            </w:pPr>
+            <w:r>
+              <w:t>0</w:t>
+            </w:r>
+          </w:p>
+        </w:tc>
+        <w:tc>
+          <w:tcPr>
+            <w:tcW w:w="4059" w:type="dxa"/>
+          </w:tcPr>
+          <w:p>
             <w:r>
               <w:rPr>
                 <w:rFonts w:ascii="Segoe UI" w:hAnsi="Segoe UI" w:cs="Segoe UI"/>
@@ -544,8 +606,62 @@
                 <w:szCs w:val="21"/>
                 <w:shd w:val="clear" w:color="auto" w:fill="FFFFFF"/>
               </w:rPr>
-              <w:t>the pen is good</w:t>
-            </w:r>
+              <w:t>The rubber is very small, maybe I want to adjust the size of the rubber</w:t>
+            </w:r>
+          </w:p>
+        </w:tc>
+      </w:tr>
+      <w:tr>
+        <w:tc>
+          <w:tcPr>
+            <w:tcW w:w="1129" w:type="dxa"/>
+          </w:tcPr>
+          <w:p>
+            <w:pPr>
+              <w:jc w:val="center"/>
+            </w:pPr>
+            <w:r>
+              <w:t>4</w:t>
+            </w:r>
+          </w:p>
+        </w:tc>
+        <w:tc>
+          <w:tcPr>
+            <w:tcW w:w="1985" w:type="dxa"/>
+          </w:tcPr>
+          <w:p>
+            <w:pPr>
+              <w:jc w:val="center"/>
+            </w:pPr>
+            <w:r>
+              <w:rPr>
+                <w:rFonts w:hint="eastAsia"/>
+              </w:rPr>
+              <w:t>15</w:t>
+            </w:r>
+            <w:r>
+              <w:t>s</w:t>
+            </w:r>
+          </w:p>
+        </w:tc>
+        <w:tc>
+          <w:tcPr>
+            <w:tcW w:w="1843" w:type="dxa"/>
+          </w:tcPr>
+          <w:p>
+            <w:pPr>
+              <w:jc w:val="center"/>
+            </w:pPr>
+            <w:r>
+              <w:t>0</w:t>
+            </w:r>
+          </w:p>
+        </w:tc>
+        <w:tc>
+          <w:tcPr>
+            <w:tcW w:w="4059" w:type="dxa"/>
+          </w:tcPr>
+          <w:p>
             <w:r>
               <w:rPr>
                 <w:rFonts w:ascii="Segoe UI" w:hAnsi="Segoe UI" w:cs="Segoe UI"/>
@@ -554,8 +670,62 @@
                 <w:szCs w:val="21"/>
                 <w:shd w:val="clear" w:color="auto" w:fill="FFFFFF"/>
               </w:rPr>
-              <w:t xml:space="preserve">, you can change the angle; the position of the pen can be adjusted; the pen is a bit far away on the drawing board, and it is </w:t>
-            </w:r>
+              <w:t xml:space="preserve">It's hanging in the air </w:t>
+            </w:r>
+          </w:p>
+        </w:tc>
+      </w:tr>
+      <w:tr>
+        <w:tc>
+          <w:tcPr>
+            <w:tcW w:w="1129" w:type="dxa"/>
+          </w:tcPr>
+          <w:p>
+            <w:pPr>
+              <w:jc w:val="center"/>
+            </w:pPr>
+            <w:r>
+              <w:t>5</w:t>
+            </w:r>
+          </w:p>
+        </w:tc>
+        <w:tc>
+          <w:tcPr>
+            <w:tcW w:w="1985" w:type="dxa"/>
+          </w:tcPr>
+          <w:p>
+            <w:pPr>
+              <w:jc w:val="center"/>
+            </w:pPr>
+            <w:r>
+              <w:rPr>
+                <w:rFonts w:hint="eastAsia"/>
+              </w:rPr>
+              <w:t>30</w:t>
+            </w:r>
+            <w:r>
+              <w:t>s</w:t>
+            </w:r>
+          </w:p>
+        </w:tc>
+        <w:tc>
+          <w:tcPr>
+            <w:tcW w:w="1843" w:type="dxa"/>
+          </w:tcPr>
+          <w:p>
+            <w:pPr>
+              <w:jc w:val="center"/>
+            </w:pPr>
+            <w:r>
+              <w:t>0</w:t>
+            </w:r>
+          </w:p>
+        </w:tc>
+        <w:tc>
+          <w:tcPr>
+            <w:tcW w:w="4059" w:type="dxa"/>
+          </w:tcPr>
+          <w:p>
             <w:r>
               <w:rPr>
                 <w:rFonts w:ascii="Segoe UI" w:hAnsi="Segoe UI" w:cs="Segoe UI"/>
@@ -564,8 +734,62 @@
                 <w:szCs w:val="21"/>
                 <w:shd w:val="clear" w:color="auto" w:fill="FFFFFF"/>
               </w:rPr>
-              <w:t xml:space="preserve">a little </w:t>
-            </w:r>
+              <w:t>This function is amazing</w:t>
+            </w:r>
+          </w:p>
+        </w:tc>
+      </w:tr>
+      <w:tr>
+        <w:tc>
+          <w:tcPr>
+            <w:tcW w:w="1129" w:type="dxa"/>
+          </w:tcPr>
+          <w:p>
+            <w:pPr>
+              <w:jc w:val="center"/>
+            </w:pPr>
+            <w:r>
+              <w:t>6</w:t>
+            </w:r>
+          </w:p>
+        </w:tc>
+        <w:tc>
+          <w:tcPr>
+            <w:tcW w:w="1985" w:type="dxa"/>
+          </w:tcPr>
+          <w:p>
+            <w:pPr>
+              <w:jc w:val="center"/>
+            </w:pPr>
+            <w:r>
+              <w:rPr>
+                <w:rFonts w:hint="eastAsia"/>
+              </w:rPr>
+              <w:t>25</w:t>
+            </w:r>
+            <w:r>
+              <w:t>s</w:t>
+            </w:r>
+          </w:p>
+        </w:tc>
+        <w:tc>
+          <w:tcPr>
+            <w:tcW w:w="1843" w:type="dxa"/>
+          </w:tcPr>
+          <w:p>
+            <w:pPr>
+              <w:jc w:val="center"/>
+            </w:pPr>
+            <w:r>
+              <w:t>0</w:t>
+            </w:r>
+          </w:p>
+        </w:tc>
+        <w:tc>
+          <w:tcPr>
+            <w:tcW w:w="4059" w:type="dxa"/>
+          </w:tcPr>
+          <w:p>
             <w:r>
               <w:rPr>
                 <w:rFonts w:ascii="Segoe UI" w:hAnsi="Segoe UI" w:cs="Segoe UI"/>
@@ -574,7 +798,7 @@
                 <w:szCs w:val="21"/>
                 <w:shd w:val="clear" w:color="auto" w:fill="FFFFFF"/>
               </w:rPr>
-              <w:t>difficult to control it</w:t>
+              <w:t>After this painting is placed on the wall, you can turn on a light, just like I have completed a work</w:t>
             </w:r>
           </w:p>
         </w:tc>
@@ -589,7 +813,7 @@
               <w:jc w:val="center"/>
             </w:pPr>
             <w:r>
-              <w:t>3</w:t>
+              <w:t>7</w:t>
             </w:r>
           </w:p>
         </w:tc>
@@ -600,15 +824,15 @@
           <w:p>
             <w:pPr>
               <w:jc w:val="center"/>
+            </w:pPr>
+            <w:r>
               <w:rPr>
                 <w:rFonts w:hint="eastAsia"/>
               </w:rPr>
-            </w:pPr>
-            <w:r>
-              <w:rPr>
-                <w:rFonts w:hint="eastAsia"/>
-              </w:rPr>
-              <w:t>25</w:t>
+              <w:t>40</w:t>
+            </w:r>
+            <w:r>
+              <w:t>s</w:t>
             </w:r>
           </w:p>
         </w:tc>
@@ -638,318 +862,7 @@
                 <w:szCs w:val="21"/>
                 <w:shd w:val="clear" w:color="auto" w:fill="FFFFFF"/>
               </w:rPr>
-              <w:t>The rubber is very small</w:t>
-            </w:r>
-            <w:r>
-              <w:rPr>
-                <w:rFonts w:ascii="Segoe UI" w:hAnsi="Segoe UI" w:cs="Segoe UI"/>
-                <w:color w:val="202124"/>
-                <w:sz w:val="21"/>
-                <w:szCs w:val="21"/>
-                <w:shd w:val="clear" w:color="auto" w:fill="FFFFFF"/>
-              </w:rPr>
-              <w:t>,</w:t>
-            </w:r>
-            <w:r>
-              <w:rPr>
-                <w:rFonts w:ascii="Segoe UI" w:hAnsi="Segoe UI" w:cs="Segoe UI"/>
-                <w:color w:val="202124"/>
-                <w:sz w:val="21"/>
-                <w:szCs w:val="21"/>
-                <w:shd w:val="clear" w:color="auto" w:fill="FFFFFF"/>
-              </w:rPr>
-              <w:t xml:space="preserve"> </w:t>
-            </w:r>
-            <w:r>
-              <w:rPr>
-                <w:rFonts w:ascii="Segoe UI" w:hAnsi="Segoe UI" w:cs="Segoe UI"/>
-                <w:color w:val="202124"/>
-                <w:sz w:val="21"/>
-                <w:szCs w:val="21"/>
-                <w:shd w:val="clear" w:color="auto" w:fill="FFFFFF"/>
-              </w:rPr>
-              <w:t>maybe I want to adjust the</w:t>
-            </w:r>
-            <w:r>
-              <w:rPr>
-                <w:rFonts w:ascii="Segoe UI" w:hAnsi="Segoe UI" w:cs="Segoe UI"/>
-                <w:color w:val="202124"/>
-                <w:sz w:val="21"/>
-                <w:szCs w:val="21"/>
-                <w:shd w:val="clear" w:color="auto" w:fill="FFFFFF"/>
-              </w:rPr>
-              <w:t xml:space="preserve"> size of the rubber</w:t>
-            </w:r>
-          </w:p>
-        </w:tc>
-      </w:tr>
-      <w:tr>
-        <w:tc>
-          <w:tcPr>
-            <w:tcW w:w="1129" w:type="dxa"/>
-          </w:tcPr>
-          <w:p>
-            <w:pPr>
-              <w:jc w:val="center"/>
-            </w:pPr>
-            <w:r>
-              <w:t>4</w:t>
-            </w:r>
-          </w:p>
-        </w:tc>
-        <w:tc>
-          <w:tcPr>
-            <w:tcW w:w="1985" w:type="dxa"/>
-          </w:tcPr>
-          <w:p>
-            <w:pPr>
-              <w:jc w:val="center"/>
-              <w:rPr>
-                <w:rFonts w:hint="eastAsia"/>
-              </w:rPr>
-            </w:pPr>
-            <w:r>
-              <w:rPr>
-                <w:rFonts w:hint="eastAsia"/>
-              </w:rPr>
-              <w:t>15</w:t>
-            </w:r>
-          </w:p>
-        </w:tc>
-        <w:tc>
-          <w:tcPr>
-            <w:tcW w:w="1843" w:type="dxa"/>
-          </w:tcPr>
-          <w:p>
-            <w:pPr>
-              <w:jc w:val="center"/>
-            </w:pPr>
-            <w:r>
-              <w:t>0</w:t>
-            </w:r>
-          </w:p>
-        </w:tc>
-        <w:tc>
-          <w:tcPr>
-            <w:tcW w:w="4059" w:type="dxa"/>
-          </w:tcPr>
-          <w:p>
-            <w:r>
-              <w:rPr>
-                <w:rFonts w:ascii="Segoe UI" w:hAnsi="Segoe UI" w:cs="Segoe UI"/>
-                <w:color w:val="202124"/>
-                <w:sz w:val="21"/>
-                <w:szCs w:val="21"/>
-                <w:shd w:val="clear" w:color="auto" w:fill="FFFFFF"/>
-              </w:rPr>
-              <w:t xml:space="preserve">It's hanging in the air </w:t>
-            </w:r>
-          </w:p>
-        </w:tc>
-      </w:tr>
-      <w:tr>
-        <w:tc>
-          <w:tcPr>
-            <w:tcW w:w="1129" w:type="dxa"/>
-          </w:tcPr>
-          <w:p>
-            <w:pPr>
-              <w:jc w:val="center"/>
-            </w:pPr>
-            <w:r>
-              <w:t>5</w:t>
-            </w:r>
-          </w:p>
-        </w:tc>
-        <w:tc>
-          <w:tcPr>
-            <w:tcW w:w="1985" w:type="dxa"/>
-          </w:tcPr>
-          <w:p>
-            <w:pPr>
-              <w:jc w:val="center"/>
-              <w:rPr>
-                <w:rFonts w:hint="eastAsia"/>
-              </w:rPr>
-            </w:pPr>
-            <w:r>
-              <w:rPr>
-                <w:rFonts w:hint="eastAsia"/>
-              </w:rPr>
-              <w:t>30</w:t>
-            </w:r>
-          </w:p>
-        </w:tc>
-        <w:tc>
-          <w:tcPr>
-            <w:tcW w:w="1843" w:type="dxa"/>
-          </w:tcPr>
-          <w:p>
-            <w:pPr>
-              <w:jc w:val="center"/>
-            </w:pPr>
-            <w:r>
-              <w:t>0</w:t>
-            </w:r>
-          </w:p>
-        </w:tc>
-        <w:tc>
-          <w:tcPr>
-            <w:tcW w:w="4059" w:type="dxa"/>
-          </w:tcPr>
-          <w:p>
-            <w:r>
-              <w:rPr>
-                <w:rFonts w:ascii="Segoe UI" w:hAnsi="Segoe UI" w:cs="Segoe UI"/>
-                <w:color w:val="202124"/>
-                <w:sz w:val="21"/>
-                <w:szCs w:val="21"/>
-                <w:shd w:val="clear" w:color="auto" w:fill="FFFFFF"/>
-              </w:rPr>
-              <w:t>This function is amazing</w:t>
-            </w:r>
-          </w:p>
-        </w:tc>
-      </w:tr>
-      <w:tr>
-        <w:tc>
-          <w:tcPr>
-            <w:tcW w:w="1129" w:type="dxa"/>
-          </w:tcPr>
-          <w:p>
-            <w:pPr>
-              <w:jc w:val="center"/>
-            </w:pPr>
-            <w:r>
-              <w:t>6</w:t>
-            </w:r>
-          </w:p>
-        </w:tc>
-        <w:tc>
-          <w:tcPr>
-            <w:tcW w:w="1985" w:type="dxa"/>
-          </w:tcPr>
-          <w:p>
-            <w:pPr>
-              <w:jc w:val="center"/>
-              <w:rPr>
-                <w:rFonts w:hint="eastAsia"/>
-              </w:rPr>
-            </w:pPr>
-            <w:r>
-              <w:rPr>
-                <w:rFonts w:hint="eastAsia"/>
-              </w:rPr>
-              <w:t>25</w:t>
-            </w:r>
-          </w:p>
-        </w:tc>
-        <w:tc>
-          <w:tcPr>
-            <w:tcW w:w="1843" w:type="dxa"/>
-          </w:tcPr>
-          <w:p>
-            <w:pPr>
-              <w:jc w:val="center"/>
-            </w:pPr>
-            <w:r>
-              <w:t>0</w:t>
-            </w:r>
-          </w:p>
-        </w:tc>
-        <w:tc>
-          <w:tcPr>
-            <w:tcW w:w="4059" w:type="dxa"/>
-          </w:tcPr>
-          <w:p>
-            <w:pPr>
-              <w:rPr>
-                <w:rFonts w:hint="eastAsia"/>
-              </w:rPr>
-            </w:pPr>
-            <w:r>
-              <w:rPr>
-                <w:rFonts w:ascii="Segoe UI" w:hAnsi="Segoe UI" w:cs="Segoe UI"/>
-                <w:color w:val="202124"/>
-                <w:sz w:val="21"/>
-                <w:szCs w:val="21"/>
-                <w:shd w:val="clear" w:color="auto" w:fill="FFFFFF"/>
-              </w:rPr>
-              <w:t>After this painting is placed on the wall, you can turn on a light, just like I have completed a work</w:t>
-            </w:r>
-          </w:p>
-        </w:tc>
-      </w:tr>
-      <w:tr>
-        <w:tc>
-          <w:tcPr>
-            <w:tcW w:w="1129" w:type="dxa"/>
-          </w:tcPr>
-          <w:p>
-            <w:pPr>
-              <w:jc w:val="center"/>
-            </w:pPr>
-            <w:r>
-              <w:t>7</w:t>
-            </w:r>
-          </w:p>
-        </w:tc>
-        <w:tc>
-          <w:tcPr>
-            <w:tcW w:w="1985" w:type="dxa"/>
-          </w:tcPr>
-          <w:p>
-            <w:pPr>
-              <w:jc w:val="center"/>
-              <w:rPr>
-                <w:rFonts w:hint="eastAsia"/>
-              </w:rPr>
-            </w:pPr>
-            <w:r>
-              <w:rPr>
-                <w:rFonts w:hint="eastAsia"/>
-              </w:rPr>
-              <w:t>40</w:t>
-            </w:r>
-          </w:p>
-        </w:tc>
-        <w:tc>
-          <w:tcPr>
-            <w:tcW w:w="1843" w:type="dxa"/>
-          </w:tcPr>
-          <w:p>
-            <w:pPr>
-              <w:jc w:val="center"/>
-            </w:pPr>
-            <w:r>
-              <w:t>0</w:t>
-            </w:r>
-          </w:p>
-        </w:tc>
-        <w:tc>
-          <w:tcPr>
-            <w:tcW w:w="4059" w:type="dxa"/>
-          </w:tcPr>
-          <w:p>
-            <w:r>
-              <w:rPr>
-                <w:rFonts w:ascii="Segoe UI" w:hAnsi="Segoe UI" w:cs="Segoe UI"/>
-                <w:color w:val="202124"/>
-                <w:sz w:val="21"/>
-                <w:szCs w:val="21"/>
-                <w:shd w:val="clear" w:color="auto" w:fill="FFFFFF"/>
-              </w:rPr>
-              <w:t>Oh, I didn’t know to start with trigger at the beginning, but after learning it, the operation is very smooth, so you can add a prompt board. Oh, I fell</w:t>
-            </w:r>
-            <w:r>
-              <w:rPr>
-                <w:rFonts w:ascii="Segoe UI" w:hAnsi="Segoe UI" w:cs="Segoe UI"/>
-                <w:color w:val="202124"/>
-                <w:sz w:val="21"/>
-                <w:szCs w:val="21"/>
-                <w:shd w:val="clear" w:color="auto" w:fill="FFFFFF"/>
-              </w:rPr>
-              <w:t>….</w:t>
+              <w:t>Oh, I didn’t know to start with trigger at the beginning, but after learning it, the operation is very smooth, so you can add a prompt board. Oh, I fell….</w:t>
             </w:r>
           </w:p>
         </w:tc>
@@ -969,11 +882,6 @@
     <w:bookmarkEnd w:id="2"/>
     <w:p/>
     <w:p>
-      <w:pPr>
-        <w:rPr>
-          <w:rFonts w:hint="eastAsia"/>
-        </w:rPr>
-      </w:pPr>
       <w:r>
         <w:lastRenderedPageBreak/>
         <w:t>Overall satisfactory? (1-5)</w:t>
@@ -1084,6 +992,9 @@
             <w:pPr>
               <w:jc w:val="center"/>
             </w:pPr>
+            <w:r>
+              <w:t>20s</w:t>
+            </w:r>
           </w:p>
         </w:tc>
         <w:tc>
@@ -1103,7 +1014,11 @@
           <w:tcPr>
             <w:tcW w:w="4059" w:type="dxa"/>
           </w:tcPr>
-          <w:p/>
+          <w:p>
+            <w:r>
+              <w:t>/</w:t>
+            </w:r>
+          </w:p>
         </w:tc>
       </w:tr>
       <w:tr>
@@ -1128,6 +1043,12 @@
             <w:pPr>
               <w:jc w:val="center"/>
             </w:pPr>
+            <w:r>
+              <w:t>35</w:t>
+            </w:r>
+            <w:r>
+              <w:t>s</w:t>
+            </w:r>
           </w:p>
         </w:tc>
         <w:tc>
@@ -1147,7 +1068,67 @@
           <w:tcPr>
             <w:tcW w:w="4059" w:type="dxa"/>
           </w:tcPr>
-          <w:p/>
+          <w:p>
+            <w:pPr>
+              <w:tabs>
+                <w:tab w:val="left" w:pos="560"/>
+                <w:tab w:val="left" w:pos="1120"/>
+                <w:tab w:val="left" w:pos="1680"/>
+                <w:tab w:val="left" w:pos="2240"/>
+                <w:tab w:val="left" w:pos="2800"/>
+                <w:tab w:val="left" w:pos="3360"/>
+                <w:tab w:val="left" w:pos="3920"/>
+                <w:tab w:val="left" w:pos="4480"/>
+                <w:tab w:val="left" w:pos="5040"/>
+                <w:tab w:val="left" w:pos="5600"/>
+                <w:tab w:val="left" w:pos="6160"/>
+                <w:tab w:val="left" w:pos="6720"/>
+              </w:tabs>
+              <w:autoSpaceDE w:val="0"/>
+              <w:autoSpaceDN w:val="0"/>
+              <w:adjustRightInd w:val="0"/>
+              <w:rPr>
+                <w:rFonts w:ascii="Arial" w:hAnsi="Arial" w:cs="Arial"/>
+                <w:color w:val="000000"/>
+                <w:kern w:val="0"/>
+                <w:sz w:val="20"/>
+                <w:szCs w:val="20"/>
+                <w:lang w:val="en-GB"/>
+              </w:rPr>
+            </w:pPr>
+            <w:r>
+              <w:rPr>
+                <w:rFonts w:ascii="Arial" w:hAnsi="Arial" w:cs="Arial"/>
+                <w:sz w:val="20"/>
+                <w:szCs w:val="20"/>
+              </w:rPr>
+              <w:t>Is it grab? I think it’s grab; I don’t need to keep holding it.</w:t>
+            </w:r>
+            <w:r>
+              <w:rPr>
+                <w:rFonts w:ascii="Arial" w:hAnsi="Arial" w:cs="Arial"/>
+                <w:color w:val="000000"/>
+                <w:kern w:val="0"/>
+                <w:sz w:val="20"/>
+                <w:szCs w:val="20"/>
+                <w:lang w:val="en-GB"/>
+              </w:rPr>
+              <w:t xml:space="preserve"> This is a bit annoying</w:t>
+            </w:r>
+            <w:bookmarkStart w:id="5" w:name="OLE_LINK2"/>
+            <w:r>
+              <w:rPr>
+                <w:rFonts w:ascii="Arial" w:hAnsi="Arial" w:cs="Arial"/>
+                <w:color w:val="000000"/>
+                <w:kern w:val="0"/>
+                <w:sz w:val="20"/>
+                <w:szCs w:val="20"/>
+                <w:lang w:val="en-GB"/>
+              </w:rPr>
+              <w:t xml:space="preserve">. </w:t>
+            </w:r>
+            <w:bookmarkEnd w:id="5"/>
+          </w:p>
         </w:tc>
       </w:tr>
       <w:tr>
@@ -1159,6 +1140,7 @@
             <w:pPr>
               <w:jc w:val="center"/>
             </w:pPr>
+            <w:bookmarkStart w:id="6" w:name="_Hlk209790567"/>
             <w:r>
               <w:t>3</w:t>
             </w:r>
@@ -1172,6 +1154,12 @@
             <w:pPr>
               <w:jc w:val="center"/>
             </w:pPr>
+            <w:r>
+              <w:t>10</w:t>
+            </w:r>
+            <w:r>
+              <w:t>s</w:t>
+            </w:r>
           </w:p>
         </w:tc>
         <w:tc>
@@ -1191,7 +1179,96 @@
           <w:tcPr>
             <w:tcW w:w="4059" w:type="dxa"/>
           </w:tcPr>
-          <w:p/>
+          <w:p>
+            <w:pPr>
+              <w:rPr>
+                <w:rFonts w:ascii="Arial" w:hAnsi="Arial" w:cs="Arial"/>
+                <w:sz w:val="20"/>
+                <w:szCs w:val="20"/>
+              </w:rPr>
+            </w:pPr>
+            <w:r>
+              <w:rPr>
+                <w:rFonts w:ascii="Arial" w:hAnsi="Arial" w:cs="Arial"/>
+                <w:color w:val="000000"/>
+                <w:kern w:val="0"/>
+                <w:sz w:val="20"/>
+                <w:szCs w:val="20"/>
+                <w:lang w:val="en-GB"/>
+              </w:rPr>
+              <w:t>Okay, fine. I am done drawing</w:t>
+            </w:r>
+          </w:p>
+        </w:tc>
+      </w:tr>
+      <w:bookmarkEnd w:id="6"/>
+      <w:tr>
+        <w:tc>
+          <w:tcPr>
+            <w:tcW w:w="1129" w:type="dxa"/>
+          </w:tcPr>
+          <w:p>
+            <w:pPr>
+              <w:jc w:val="center"/>
+            </w:pPr>
+            <w:r>
+              <w:t>4</w:t>
+            </w:r>
+          </w:p>
+        </w:tc>
+        <w:tc>
+          <w:tcPr>
+            <w:tcW w:w="1985" w:type="dxa"/>
+          </w:tcPr>
+          <w:p>
+            <w:pPr>
+              <w:jc w:val="center"/>
+            </w:pPr>
+            <w:r>
+              <w:t>19</w:t>
+            </w:r>
+            <w:r>
+              <w:t>s</w:t>
+            </w:r>
+          </w:p>
+        </w:tc>
+        <w:tc>
+          <w:tcPr>
+            <w:tcW w:w="1843" w:type="dxa"/>
+          </w:tcPr>
+          <w:p>
+            <w:pPr>
+              <w:jc w:val="center"/>
+            </w:pPr>
+            <w:r>
+              <w:t>0</w:t>
+            </w:r>
+          </w:p>
+        </w:tc>
+        <w:tc>
+          <w:tcPr>
+            <w:tcW w:w="4059" w:type="dxa"/>
+          </w:tcPr>
+          <w:p>
+            <w:pPr>
+              <w:rPr>
+                <w:rFonts w:ascii="Arial" w:hAnsi="Arial" w:cs="Arial"/>
+                <w:sz w:val="20"/>
+                <w:szCs w:val="20"/>
+              </w:rPr>
+            </w:pPr>
+            <w:r>
+              <w:rPr>
+                <w:rFonts w:ascii="Arial" w:hAnsi="Arial" w:cs="Arial"/>
+                <w:color w:val="000000"/>
+                <w:kern w:val="0"/>
+                <w:sz w:val="20"/>
+                <w:szCs w:val="20"/>
+                <w:lang w:val="en-GB"/>
+              </w:rPr>
+              <w:t>Okay, I am putting it on the air.</w:t>
+            </w:r>
+          </w:p>
         </w:tc>
       </w:tr>
       <w:tr>
@@ -1204,7 +1281,7 @@
               <w:jc w:val="center"/>
             </w:pPr>
             <w:r>
-              <w:t>4</w:t>
+              <w:t>5</w:t>
             </w:r>
           </w:p>
         </w:tc>
@@ -1216,6 +1293,12 @@
             <w:pPr>
               <w:jc w:val="center"/>
             </w:pPr>
+            <w:r>
+              <w:t>22</w:t>
+            </w:r>
+            <w:r>
+              <w:t>s</w:t>
+            </w:r>
           </w:p>
         </w:tc>
         <w:tc>
@@ -1235,7 +1318,37 @@
           <w:tcPr>
             <w:tcW w:w="4059" w:type="dxa"/>
           </w:tcPr>
-          <w:p/>
+          <w:p>
+            <w:pPr>
+              <w:rPr>
+                <w:rFonts w:ascii="Arial" w:hAnsi="Arial" w:cs="Arial"/>
+                <w:sz w:val="20"/>
+                <w:szCs w:val="20"/>
+              </w:rPr>
+            </w:pPr>
+            <w:r>
+              <w:rPr>
+                <w:rFonts w:ascii="Arial" w:hAnsi="Arial" w:cs="Arial"/>
+                <w:color w:val="000000"/>
+                <w:kern w:val="0"/>
+                <w:sz w:val="20"/>
+                <w:szCs w:val="20"/>
+                <w:lang w:val="en-GB"/>
+              </w:rPr>
+              <w:t>I can place it and move it anywhere I want.</w:t>
+            </w:r>
+            <w:r>
+              <w:rPr>
+                <w:rFonts w:ascii="Arial" w:hAnsi="Arial" w:cs="Arial"/>
+                <w:color w:val="000000"/>
+                <w:kern w:val="0"/>
+                <w:sz w:val="20"/>
+                <w:szCs w:val="20"/>
+                <w:lang w:val="en-GB"/>
+              </w:rPr>
+              <w:t xml:space="preserve"> I can make it small yep, yahoo</w:t>
+            </w:r>
+          </w:p>
         </w:tc>
       </w:tr>
       <w:tr>
@@ -1248,7 +1361,7 @@
               <w:jc w:val="center"/>
             </w:pPr>
             <w:r>
-              <w:t>5</w:t>
+              <w:t>6</w:t>
             </w:r>
           </w:p>
         </w:tc>
@@ -1260,6 +1373,9 @@
             <w:pPr>
               <w:jc w:val="center"/>
             </w:pPr>
+            <w:r>
+              <w:t>12s</w:t>
+            </w:r>
           </w:p>
         </w:tc>
         <w:tc>
@@ -1279,7 +1395,26 @@
           <w:tcPr>
             <w:tcW w:w="4059" w:type="dxa"/>
           </w:tcPr>
-          <w:p/>
+          <w:p>
+            <w:pPr>
+              <w:rPr>
+                <w:rFonts w:ascii="Arial" w:hAnsi="Arial" w:cs="Arial"/>
+                <w:sz w:val="20"/>
+                <w:szCs w:val="20"/>
+              </w:rPr>
+            </w:pPr>
+            <w:r>
+              <w:rPr>
+                <w:rFonts w:ascii="Arial" w:hAnsi="Arial" w:cs="Arial"/>
+                <w:color w:val="000000"/>
+                <w:kern w:val="0"/>
+                <w:sz w:val="20"/>
+                <w:szCs w:val="20"/>
+                <w:lang w:val="en-GB"/>
+              </w:rPr>
+              <w:t>There's no wall as such. Okay, I'll put it on top of this PC.</w:t>
+            </w:r>
+          </w:p>
         </w:tc>
       </w:tr>
       <w:tr>
@@ -1292,7 +1427,7 @@
               <w:jc w:val="center"/>
             </w:pPr>
             <w:r>
-              <w:t>6</w:t>
+              <w:t>7</w:t>
             </w:r>
           </w:p>
         </w:tc>
@@ -1304,6 +1439,9 @@
             <w:pPr>
               <w:jc w:val="center"/>
             </w:pPr>
+            <w:r>
+              <w:t>~</w:t>
+            </w:r>
           </w:p>
         </w:tc>
         <w:tc>
@@ -1323,51 +1461,210 @@
           <w:tcPr>
             <w:tcW w:w="4059" w:type="dxa"/>
           </w:tcPr>
-          <w:p/>
-        </w:tc>
-      </w:tr>
-      <w:tr>
-        <w:tc>
-          <w:tcPr>
-            <w:tcW w:w="1129" w:type="dxa"/>
-          </w:tcPr>
-          <w:p>
-            <w:pPr>
-              <w:jc w:val="center"/>
-            </w:pPr>
-            <w:r>
-              <w:t>7</w:t>
-            </w:r>
-          </w:p>
-        </w:tc>
-        <w:tc>
-          <w:tcPr>
-            <w:tcW w:w="1985" w:type="dxa"/>
-          </w:tcPr>
-          <w:p>
-            <w:pPr>
-              <w:jc w:val="center"/>
-            </w:pPr>
-          </w:p>
-        </w:tc>
-        <w:tc>
-          <w:tcPr>
-            <w:tcW w:w="1843" w:type="dxa"/>
-          </w:tcPr>
-          <w:p>
-            <w:pPr>
-              <w:jc w:val="center"/>
-            </w:pPr>
-            <w:r>
-              <w:t>0</w:t>
-            </w:r>
-          </w:p>
-        </w:tc>
-        <w:tc>
-          <w:tcPr>
-            <w:tcW w:w="4059" w:type="dxa"/>
-          </w:tcPr>
-          <w:p/>
+          <w:p>
+            <w:pPr>
+              <w:tabs>
+                <w:tab w:val="left" w:pos="560"/>
+                <w:tab w:val="left" w:pos="1120"/>
+                <w:tab w:val="left" w:pos="1680"/>
+                <w:tab w:val="left" w:pos="2240"/>
+                <w:tab w:val="left" w:pos="2800"/>
+                <w:tab w:val="left" w:pos="3360"/>
+                <w:tab w:val="left" w:pos="3920"/>
+                <w:tab w:val="left" w:pos="4480"/>
+                <w:tab w:val="left" w:pos="5040"/>
+                <w:tab w:val="left" w:pos="5600"/>
+                <w:tab w:val="left" w:pos="6160"/>
+                <w:tab w:val="left" w:pos="6720"/>
+              </w:tabs>
+              <w:autoSpaceDE w:val="0"/>
+              <w:autoSpaceDN w:val="0"/>
+              <w:adjustRightInd w:val="0"/>
+              <w:rPr>
+                <w:rFonts w:ascii="Arial" w:hAnsi="Arial" w:cs="Arial"/>
+                <w:color w:val="000000"/>
+                <w:kern w:val="0"/>
+                <w:sz w:val="20"/>
+                <w:szCs w:val="20"/>
+                <w:lang w:val="en-GB"/>
+              </w:rPr>
+            </w:pPr>
+            <w:r>
+              <w:rPr>
+                <w:rFonts w:ascii="Arial" w:hAnsi="Arial" w:cs="Arial"/>
+                <w:color w:val="000000"/>
+                <w:kern w:val="0"/>
+                <w:sz w:val="20"/>
+                <w:szCs w:val="20"/>
+                <w:lang w:val="en-GB"/>
+              </w:rPr>
+              <w:t xml:space="preserve">So, one issue I'm having... The biggest issue I'm having is the pen constantly writes on the canvas and the canvas detects the position from </w:t>
+            </w:r>
+            <w:proofErr w:type="gramStart"/>
+            <w:r>
+              <w:rPr>
+                <w:rFonts w:ascii="Arial" w:hAnsi="Arial" w:cs="Arial"/>
+                <w:color w:val="000000"/>
+                <w:kern w:val="0"/>
+                <w:sz w:val="20"/>
+                <w:szCs w:val="20"/>
+                <w:lang w:val="en-GB"/>
+              </w:rPr>
+              <w:t>really far</w:t>
+            </w:r>
+            <w:proofErr w:type="gramEnd"/>
+            <w:r>
+              <w:rPr>
+                <w:rFonts w:ascii="Arial" w:hAnsi="Arial" w:cs="Arial"/>
+                <w:color w:val="000000"/>
+                <w:kern w:val="0"/>
+                <w:sz w:val="20"/>
+                <w:szCs w:val="20"/>
+                <w:lang w:val="en-GB"/>
+              </w:rPr>
+              <w:t xml:space="preserve"> away. Oh, yeah. </w:t>
+            </w:r>
+            <w:proofErr w:type="gramStart"/>
+            <w:r>
+              <w:rPr>
+                <w:rFonts w:ascii="Arial" w:hAnsi="Arial" w:cs="Arial"/>
+                <w:color w:val="000000"/>
+                <w:kern w:val="0"/>
+                <w:sz w:val="20"/>
+                <w:szCs w:val="20"/>
+                <w:lang w:val="en-GB"/>
+              </w:rPr>
+              <w:t>So</w:t>
+            </w:r>
+            <w:proofErr w:type="gramEnd"/>
+            <w:r>
+              <w:rPr>
+                <w:rFonts w:ascii="Arial" w:hAnsi="Arial" w:cs="Arial"/>
+                <w:color w:val="000000"/>
+                <w:kern w:val="0"/>
+                <w:sz w:val="20"/>
+                <w:szCs w:val="20"/>
+                <w:lang w:val="en-GB"/>
+              </w:rPr>
+              <w:t xml:space="preserve"> it's, it's as, this is where the, this is where the canvas </w:t>
+            </w:r>
+            <w:proofErr w:type="gramStart"/>
+            <w:r>
+              <w:rPr>
+                <w:rFonts w:ascii="Arial" w:hAnsi="Arial" w:cs="Arial"/>
+                <w:color w:val="000000"/>
+                <w:kern w:val="0"/>
+                <w:sz w:val="20"/>
+                <w:szCs w:val="20"/>
+                <w:lang w:val="en-GB"/>
+              </w:rPr>
+              <w:t>is</w:t>
+            </w:r>
+            <w:proofErr w:type="gramEnd"/>
+            <w:r>
+              <w:rPr>
+                <w:rFonts w:ascii="Arial" w:hAnsi="Arial" w:cs="Arial"/>
+                <w:color w:val="000000"/>
+                <w:kern w:val="0"/>
+                <w:sz w:val="20"/>
+                <w:szCs w:val="20"/>
+                <w:lang w:val="en-GB"/>
+              </w:rPr>
+              <w:t xml:space="preserve"> and this is where my pen is present. It does a little bit too far away. It's </w:t>
+            </w:r>
+            <w:proofErr w:type="gramStart"/>
+            <w:r>
+              <w:rPr>
+                <w:rFonts w:ascii="Arial" w:hAnsi="Arial" w:cs="Arial"/>
+                <w:color w:val="000000"/>
+                <w:kern w:val="0"/>
+                <w:sz w:val="20"/>
+                <w:szCs w:val="20"/>
+                <w:lang w:val="en-GB"/>
+              </w:rPr>
+              <w:t>really far</w:t>
+            </w:r>
+            <w:proofErr w:type="gramEnd"/>
+            <w:r>
+              <w:rPr>
+                <w:rFonts w:ascii="Arial" w:hAnsi="Arial" w:cs="Arial"/>
+                <w:color w:val="000000"/>
+                <w:kern w:val="0"/>
+                <w:sz w:val="20"/>
+                <w:szCs w:val="20"/>
+                <w:lang w:val="en-GB"/>
+              </w:rPr>
+              <w:t xml:space="preserve"> away and so I'm just making random lines.</w:t>
+            </w:r>
+          </w:p>
+          <w:p>
+            <w:pPr>
+              <w:rPr>
+                <w:rFonts w:ascii="Arial" w:hAnsi="Arial" w:cs="Arial"/>
+                <w:sz w:val="20"/>
+                <w:szCs w:val="20"/>
+              </w:rPr>
+            </w:pPr>
+            <w:r>
+              <w:rPr>
+                <w:rFonts w:ascii="Helvetica" w:hAnsi="Helvetica" w:cs="Helvetica"/>
+                <w:color w:val="000000"/>
+                <w:kern w:val="0"/>
+                <w:sz w:val="20"/>
+                <w:szCs w:val="20"/>
+                <w:lang w:val="en-GB"/>
+              </w:rPr>
+              <w:t xml:space="preserve">I think one thing that would help is if there is some form of a button that enables it and then I can start. Ah, I see. But if you want to keep the distance...So if it was supposed to be placed in the real world, what would have happened is, when I turn around, it will still stay, it would, uh, it </w:t>
+            </w:r>
+            <w:proofErr w:type="gramStart"/>
+            <w:r>
+              <w:rPr>
+                <w:rFonts w:ascii="Helvetica" w:hAnsi="Helvetica" w:cs="Helvetica"/>
+                <w:color w:val="000000"/>
+                <w:kern w:val="0"/>
+                <w:sz w:val="20"/>
+                <w:szCs w:val="20"/>
+                <w:lang w:val="en-GB"/>
+              </w:rPr>
+              <w:t>would</w:t>
+            </w:r>
+            <w:proofErr w:type="gramEnd"/>
+            <w:r>
+              <w:rPr>
+                <w:rFonts w:ascii="Helvetica" w:hAnsi="Helvetica" w:cs="Helvetica"/>
+                <w:color w:val="000000"/>
+                <w:kern w:val="0"/>
+                <w:sz w:val="20"/>
+                <w:szCs w:val="20"/>
+                <w:lang w:val="en-GB"/>
+              </w:rPr>
+              <w:t xml:space="preserve"> stay there if it is, I'm supposed to be placing it on this PC. </w:t>
+            </w:r>
+            <w:proofErr w:type="gramStart"/>
+            <w:r>
+              <w:rPr>
+                <w:rFonts w:ascii="Helvetica" w:hAnsi="Helvetica" w:cs="Helvetica"/>
+                <w:color w:val="000000"/>
+                <w:kern w:val="0"/>
+                <w:sz w:val="20"/>
+                <w:szCs w:val="20"/>
+                <w:lang w:val="en-GB"/>
+              </w:rPr>
+              <w:t>So</w:t>
+            </w:r>
+            <w:proofErr w:type="gramEnd"/>
+            <w:r>
+              <w:rPr>
+                <w:rFonts w:ascii="Helvetica" w:hAnsi="Helvetica" w:cs="Helvetica"/>
+                <w:color w:val="000000"/>
+                <w:kern w:val="0"/>
+                <w:sz w:val="20"/>
+                <w:szCs w:val="20"/>
+                <w:lang w:val="en-GB"/>
+              </w:rPr>
+              <w:t xml:space="preserve"> once I turn around, it should still stay there because I personally have not done that. It's supposed to be staying on the real world, right?</w:t>
+            </w:r>
+          </w:p>
         </w:tc>
       </w:tr>
     </w:tbl>
@@ -1376,17 +1673,25 @@
       <w:r>
         <w:t>Overall satisfactory? (1-5)</w:t>
       </w:r>
+      <w:r>
+        <w:t xml:space="preserve"> 4</w:t>
+      </w:r>
     </w:p>
+    <w:p/>
+    <w:p/>
+    <w:p/>
+    <w:p/>
     <w:p/>
     <w:p>
       <w:r>
+        <w:lastRenderedPageBreak/>
         <w:t xml:space="preserve"> Participant 3</w:t>
       </w:r>
     </w:p>
     <w:tbl>
       <w:tblPr>
         <w:tblStyle w:val="TableGrid"/>
-        <w:tblpPr w:leftFromText="180" w:rightFromText="180" w:vertAnchor="page" w:horzAnchor="margin" w:tblpY="8421"/>
+        <w:tblpPr w:leftFromText="180" w:rightFromText="180" w:vertAnchor="page" w:horzAnchor="margin" w:tblpY="1908"/>
         <w:tblW w:w="0" w:type="auto"/>
         <w:tblLook w:val="04A0" w:firstRow="1" w:lastRow="0" w:firstColumn="1" w:lastColumn="0" w:noHBand="0" w:noVBand="1"/>
       </w:tblPr>
@@ -1475,6 +1780,9 @@
             <w:pPr>
               <w:jc w:val="center"/>
             </w:pPr>
+            <w:r>
+              <w:t>20s</w:t>
+            </w:r>
           </w:p>
         </w:tc>
         <w:tc>
@@ -1494,7 +1802,11 @@
           <w:tcPr>
             <w:tcW w:w="4059" w:type="dxa"/>
           </w:tcPr>
-          <w:p/>
+          <w:p>
+            <w:r>
+              <w:t>/</w:t>
+            </w:r>
+          </w:p>
         </w:tc>
       </w:tr>
       <w:tr>
@@ -1519,6 +1831,9 @@
             <w:pPr>
               <w:jc w:val="center"/>
             </w:pPr>
+            <w:r>
+              <w:t>46s</w:t>
+            </w:r>
           </w:p>
         </w:tc>
         <w:tc>
@@ -1538,7 +1853,66 @@
           <w:tcPr>
             <w:tcW w:w="4059" w:type="dxa"/>
           </w:tcPr>
-          <w:p/>
+          <w:p>
+            <w:pPr>
+              <w:tabs>
+                <w:tab w:val="left" w:pos="560"/>
+                <w:tab w:val="left" w:pos="1120"/>
+                <w:tab w:val="left" w:pos="1680"/>
+                <w:tab w:val="left" w:pos="2240"/>
+                <w:tab w:val="left" w:pos="2800"/>
+                <w:tab w:val="left" w:pos="3360"/>
+                <w:tab w:val="left" w:pos="3920"/>
+                <w:tab w:val="left" w:pos="4480"/>
+                <w:tab w:val="left" w:pos="5040"/>
+                <w:tab w:val="left" w:pos="5600"/>
+                <w:tab w:val="left" w:pos="6160"/>
+                <w:tab w:val="left" w:pos="6720"/>
+              </w:tabs>
+              <w:autoSpaceDE w:val="0"/>
+              <w:autoSpaceDN w:val="0"/>
+              <w:adjustRightInd w:val="0"/>
+              <w:rPr>
+                <w:rFonts w:ascii="Arial" w:hAnsi="Arial" w:cs="Arial"/>
+                <w:color w:val="000000"/>
+                <w:kern w:val="0"/>
+                <w:sz w:val="20"/>
+                <w:szCs w:val="20"/>
+                <w:lang w:val="en-GB"/>
+              </w:rPr>
+            </w:pPr>
+            <w:r>
+              <w:rPr>
+                <w:rFonts w:ascii="Arial" w:hAnsi="Arial" w:cs="Arial"/>
+                <w:color w:val="000000"/>
+                <w:kern w:val="0"/>
+                <w:sz w:val="20"/>
+                <w:szCs w:val="20"/>
+                <w:lang w:val="en-GB"/>
+              </w:rPr>
+              <w:t xml:space="preserve">The thing is, I think it's too... </w:t>
+            </w:r>
+          </w:p>
+          <w:p>
+            <w:pPr>
+              <w:rPr>
+                <w:rFonts w:ascii="Arial" w:hAnsi="Arial" w:cs="Arial"/>
+                <w:sz w:val="20"/>
+                <w:szCs w:val="20"/>
+              </w:rPr>
+            </w:pPr>
+            <w:r>
+              <w:rPr>
+                <w:rFonts w:ascii="Arial" w:hAnsi="Arial" w:cs="Arial"/>
+                <w:color w:val="000000"/>
+                <w:kern w:val="0"/>
+                <w:sz w:val="20"/>
+                <w:szCs w:val="20"/>
+                <w:lang w:val="en-GB"/>
+              </w:rPr>
+              <w:t>Like, too smoothly, it’s hard to control. Especially when I move, you can just adjust the just the speed.</w:t>
+            </w:r>
+          </w:p>
         </w:tc>
       </w:tr>
       <w:tr>
@@ -1563,6 +1937,9 @@
             <w:pPr>
               <w:jc w:val="center"/>
             </w:pPr>
+            <w:r>
+              <w:t>13s</w:t>
+            </w:r>
           </w:p>
         </w:tc>
         <w:tc>
@@ -1582,7 +1959,23 @@
           <w:tcPr>
             <w:tcW w:w="4059" w:type="dxa"/>
           </w:tcPr>
-          <w:p/>
+          <w:p>
+            <w:pPr>
+              <w:rPr>
+                <w:rFonts w:ascii="Arial" w:hAnsi="Arial" w:cs="Arial"/>
+                <w:sz w:val="20"/>
+                <w:szCs w:val="20"/>
+              </w:rPr>
+            </w:pPr>
+            <w:r>
+              <w:rPr>
+                <w:rFonts w:ascii="Arial" w:hAnsi="Arial" w:cs="Arial"/>
+                <w:sz w:val="20"/>
+                <w:szCs w:val="20"/>
+              </w:rPr>
+              <w:t>/</w:t>
+            </w:r>
+          </w:p>
         </w:tc>
       </w:tr>
       <w:tr>
@@ -1607,6 +2000,9 @@
             <w:pPr>
               <w:jc w:val="center"/>
             </w:pPr>
+            <w:r>
+              <w:t>10s</w:t>
+            </w:r>
           </w:p>
         </w:tc>
         <w:tc>
@@ -1626,7 +2022,23 @@
           <w:tcPr>
             <w:tcW w:w="4059" w:type="dxa"/>
           </w:tcPr>
-          <w:p/>
+          <w:p>
+            <w:pPr>
+              <w:rPr>
+                <w:rFonts w:ascii="Arial" w:hAnsi="Arial" w:cs="Arial"/>
+                <w:sz w:val="20"/>
+                <w:szCs w:val="20"/>
+              </w:rPr>
+            </w:pPr>
+            <w:r>
+              <w:rPr>
+                <w:rFonts w:ascii="Arial" w:hAnsi="Arial" w:cs="Arial"/>
+                <w:sz w:val="20"/>
+                <w:szCs w:val="20"/>
+              </w:rPr>
+              <w:t>/</w:t>
+            </w:r>
+          </w:p>
         </w:tc>
       </w:tr>
       <w:tr>
@@ -1651,6 +2063,9 @@
             <w:pPr>
               <w:jc w:val="center"/>
             </w:pPr>
+            <w:r>
+              <w:t>15s</w:t>
+            </w:r>
           </w:p>
         </w:tc>
         <w:tc>
@@ -1670,7 +2085,23 @@
           <w:tcPr>
             <w:tcW w:w="4059" w:type="dxa"/>
           </w:tcPr>
-          <w:p/>
+          <w:p>
+            <w:pPr>
+              <w:rPr>
+                <w:rFonts w:ascii="Arial" w:hAnsi="Arial" w:cs="Arial"/>
+                <w:sz w:val="20"/>
+                <w:szCs w:val="20"/>
+              </w:rPr>
+            </w:pPr>
+            <w:r>
+              <w:rPr>
+                <w:rFonts w:ascii="Arial" w:hAnsi="Arial" w:cs="Arial"/>
+                <w:sz w:val="20"/>
+                <w:szCs w:val="20"/>
+              </w:rPr>
+              <w:t>I really love this, it’s smooth</w:t>
+            </w:r>
+          </w:p>
         </w:tc>
       </w:tr>
       <w:tr>
@@ -1695,6 +2126,9 @@
             <w:pPr>
               <w:jc w:val="center"/>
             </w:pPr>
+            <w:r>
+              <w:t>11s</w:t>
+            </w:r>
           </w:p>
         </w:tc>
         <w:tc>
@@ -1714,7 +2148,23 @@
           <w:tcPr>
             <w:tcW w:w="4059" w:type="dxa"/>
           </w:tcPr>
-          <w:p/>
+          <w:p>
+            <w:pPr>
+              <w:rPr>
+                <w:rFonts w:ascii="Arial" w:hAnsi="Arial" w:cs="Arial"/>
+                <w:sz w:val="20"/>
+                <w:szCs w:val="20"/>
+              </w:rPr>
+            </w:pPr>
+            <w:r>
+              <w:rPr>
+                <w:rFonts w:ascii="Arial" w:hAnsi="Arial" w:cs="Arial"/>
+                <w:sz w:val="20"/>
+                <w:szCs w:val="20"/>
+              </w:rPr>
+              <w:t>Ok done</w:t>
+            </w:r>
+          </w:p>
         </w:tc>
       </w:tr>
       <w:tr>
@@ -1739,6 +2189,9 @@
             <w:pPr>
               <w:jc w:val="center"/>
             </w:pPr>
+            <w:r>
+              <w:t>~</w:t>
+            </w:r>
           </w:p>
         </w:tc>
         <w:tc>
@@ -1758,7 +2211,41 @@
           <w:tcPr>
             <w:tcW w:w="4059" w:type="dxa"/>
           </w:tcPr>
-          <w:p/>
+          <w:p>
+            <w:pPr>
+              <w:rPr>
+                <w:rFonts w:ascii="Arial" w:hAnsi="Arial" w:cs="Arial"/>
+                <w:sz w:val="20"/>
+                <w:szCs w:val="20"/>
+              </w:rPr>
+            </w:pPr>
+            <w:r>
+              <w:rPr>
+                <w:rFonts w:ascii="Arial" w:hAnsi="Arial" w:cs="Arial"/>
+                <w:sz w:val="20"/>
+                <w:szCs w:val="20"/>
+              </w:rPr>
+              <w:t xml:space="preserve">Overall, I like it. The initial view is a little bit high, so I </w:t>
+            </w:r>
+            <w:proofErr w:type="gramStart"/>
+            <w:r>
+              <w:rPr>
+                <w:rFonts w:ascii="Arial" w:hAnsi="Arial" w:cs="Arial"/>
+                <w:sz w:val="20"/>
+                <w:szCs w:val="20"/>
+              </w:rPr>
+              <w:t>have to</w:t>
+            </w:r>
+            <w:proofErr w:type="gramEnd"/>
+            <w:r>
+              <w:rPr>
+                <w:rFonts w:ascii="Arial" w:hAnsi="Arial" w:cs="Arial"/>
+                <w:sz w:val="20"/>
+                <w:szCs w:val="20"/>
+              </w:rPr>
+              <w:t xml:space="preserve"> move and adjust it. The pen’s movement is too fast; it should be controllable and slow down a little bit.</w:t>
+            </w:r>
+          </w:p>
         </w:tc>
       </w:tr>
     </w:tbl>
@@ -1767,27 +2254,29 @@
       <w:r>
         <w:t>Overall satisfactory? (1-5)</w:t>
       </w:r>
-    </w:p>
-    <w:p/>
-    <w:p>
       <w:r>
-        <w:t xml:space="preserve"> </w:t>
+        <w:t xml:space="preserve"> 4</w:t>
       </w:r>
     </w:p>
     <w:p/>
     <w:p/>
     <w:p/>
     <w:p/>
-    <w:p>
-      <w:r>
-        <w:lastRenderedPageBreak/>
-        <w:t>Participant 4</w:t>
-      </w:r>
-    </w:p>
+    <w:p/>
+    <w:p/>
+    <w:p/>
+    <w:p/>
+    <w:p/>
+    <w:p/>
+    <w:p/>
+    <w:p/>
+    <w:p/>
+    <w:p/>
+    <w:p/>
     <w:tbl>
       <w:tblPr>
         <w:tblStyle w:val="TableGrid"/>
-        <w:tblpPr w:leftFromText="180" w:rightFromText="180" w:vertAnchor="page" w:horzAnchor="margin" w:tblpY="1947"/>
+        <w:tblpPr w:leftFromText="180" w:rightFromText="180" w:vertAnchor="page" w:horzAnchor="margin" w:tblpY="1856"/>
         <w:tblW w:w="0" w:type="auto"/>
         <w:tblLook w:val="04A0" w:firstRow="1" w:lastRow="0" w:firstColumn="1" w:lastColumn="0" w:noHBand="0" w:noVBand="1"/>
       </w:tblPr>
@@ -1810,6 +2299,7 @@
               <w:jc w:val="center"/>
             </w:pPr>
             <w:r>
+              <w:lastRenderedPageBreak/>
               <w:t>Task No.</w:t>
             </w:r>
           </w:p>
@@ -1876,6 +2366,9 @@
             <w:pPr>
               <w:jc w:val="center"/>
             </w:pPr>
+            <w:r>
+              <w:t>20s</w:t>
+            </w:r>
           </w:p>
         </w:tc>
         <w:tc>
@@ -1895,7 +2388,11 @@
           <w:tcPr>
             <w:tcW w:w="4059" w:type="dxa"/>
           </w:tcPr>
-          <w:p/>
+          <w:p>
+            <w:r>
+              <w:t>/</w:t>
+            </w:r>
+          </w:p>
         </w:tc>
       </w:tr>
       <w:tr>
@@ -1920,6 +2417,9 @@
             <w:pPr>
               <w:jc w:val="center"/>
             </w:pPr>
+            <w:r>
+              <w:t>1:30</w:t>
+            </w:r>
           </w:p>
         </w:tc>
         <w:tc>
@@ -1939,7 +2439,21 @@
           <w:tcPr>
             <w:tcW w:w="4059" w:type="dxa"/>
           </w:tcPr>
-          <w:p/>
+          <w:p>
+            <w:pPr>
+              <w:rPr>
+                <w:sz w:val="20"/>
+                <w:szCs w:val="20"/>
+              </w:rPr>
+            </w:pPr>
+            <w:r>
+              <w:rPr>
+                <w:sz w:val="20"/>
+                <w:szCs w:val="20"/>
+              </w:rPr>
+              <w:t>I'm looking for where this point is (0:36) Where the point is (0:37) Yes, it's the point on this canvas (0:39) Oh (0:40) It seems to be different from the trajectory of my hand movement (0:43) It should have a point (0:45) It has an entry point (0:46) It should be different from my height (0:49) It is the height I hold now (0:51) It may be different (0:52) It should have a map higher (0:55) But there is no such thing now</w:t>
+            </w:r>
+          </w:p>
         </w:tc>
       </w:tr>
       <w:tr>
@@ -1964,6 +2478,9 @@
             <w:pPr>
               <w:jc w:val="center"/>
             </w:pPr>
+            <w:r>
+              <w:t>25s</w:t>
+            </w:r>
           </w:p>
         </w:tc>
         <w:tc>
@@ -1983,7 +2500,21 @@
           <w:tcPr>
             <w:tcW w:w="4059" w:type="dxa"/>
           </w:tcPr>
-          <w:p/>
+          <w:p>
+            <w:pPr>
+              <w:rPr>
+                <w:sz w:val="20"/>
+                <w:szCs w:val="20"/>
+              </w:rPr>
+            </w:pPr>
+            <w:r>
+              <w:rPr>
+                <w:sz w:val="20"/>
+                <w:szCs w:val="20"/>
+              </w:rPr>
+              <w:t>/</w:t>
+            </w:r>
+          </w:p>
         </w:tc>
       </w:tr>
       <w:tr>
@@ -2008,6 +2539,9 @@
             <w:pPr>
               <w:jc w:val="center"/>
             </w:pPr>
+            <w:r>
+              <w:t>8s</w:t>
+            </w:r>
           </w:p>
         </w:tc>
         <w:tc>
@@ -2027,7 +2561,21 @@
           <w:tcPr>
             <w:tcW w:w="4059" w:type="dxa"/>
           </w:tcPr>
-          <w:p/>
+          <w:p>
+            <w:pPr>
+              <w:rPr>
+                <w:sz w:val="20"/>
+                <w:szCs w:val="20"/>
+              </w:rPr>
+            </w:pPr>
+            <w:r>
+              <w:rPr>
+                <w:sz w:val="20"/>
+                <w:szCs w:val="20"/>
+              </w:rPr>
+              <w:t>Pen is floating cool.</w:t>
+            </w:r>
+          </w:p>
         </w:tc>
       </w:tr>
       <w:tr>
@@ -2052,6 +2600,9 @@
             <w:pPr>
               <w:jc w:val="center"/>
             </w:pPr>
+            <w:r>
+              <w:t>33s</w:t>
+            </w:r>
           </w:p>
         </w:tc>
         <w:tc>
@@ -2063,7 +2614,7 @@
               <w:jc w:val="center"/>
             </w:pPr>
             <w:r>
-              <w:t>0</w:t>
+              <w:t>1(grab)</w:t>
             </w:r>
           </w:p>
         </w:tc>
@@ -2071,7 +2622,37 @@
           <w:tcPr>
             <w:tcW w:w="4059" w:type="dxa"/>
           </w:tcPr>
-          <w:p/>
+          <w:p>
+            <w:pPr>
+              <w:rPr>
+                <w:sz w:val="20"/>
+                <w:szCs w:val="20"/>
+              </w:rPr>
+            </w:pPr>
+            <w:r>
+              <w:rPr>
+                <w:sz w:val="20"/>
+                <w:szCs w:val="20"/>
+              </w:rPr>
+              <w:t xml:space="preserve">I can’t grab, oh I need to </w:t>
+            </w:r>
+            <w:proofErr w:type="gramStart"/>
+            <w:r>
+              <w:rPr>
+                <w:sz w:val="20"/>
+                <w:szCs w:val="20"/>
+              </w:rPr>
+              <w:t>actually grab</w:t>
+            </w:r>
+            <w:proofErr w:type="gramEnd"/>
+            <w:r>
+              <w:rPr>
+                <w:sz w:val="20"/>
+                <w:szCs w:val="20"/>
+              </w:rPr>
+              <w:t xml:space="preserve"> on the canvas, it’s nice</w:t>
+            </w:r>
+          </w:p>
         </w:tc>
       </w:tr>
       <w:tr>
@@ -2096,6 +2677,9 @@
             <w:pPr>
               <w:jc w:val="center"/>
             </w:pPr>
+            <w:r>
+              <w:t>10s</w:t>
+            </w:r>
           </w:p>
         </w:tc>
         <w:tc>
@@ -2115,7 +2699,21 @@
           <w:tcPr>
             <w:tcW w:w="4059" w:type="dxa"/>
           </w:tcPr>
-          <w:p/>
+          <w:p>
+            <w:pPr>
+              <w:rPr>
+                <w:sz w:val="20"/>
+                <w:szCs w:val="20"/>
+              </w:rPr>
+            </w:pPr>
+            <w:r>
+              <w:rPr>
+                <w:sz w:val="20"/>
+                <w:szCs w:val="20"/>
+              </w:rPr>
+              <w:t>It’s easy.</w:t>
+            </w:r>
+          </w:p>
         </w:tc>
       </w:tr>
       <w:tr>
@@ -2140,6 +2738,9 @@
             <w:pPr>
               <w:jc w:val="center"/>
             </w:pPr>
+            <w:r>
+              <w:t>~</w:t>
+            </w:r>
           </w:p>
         </w:tc>
         <w:tc>
@@ -2159,26 +2760,104 @@
           <w:tcPr>
             <w:tcW w:w="4059" w:type="dxa"/>
           </w:tcPr>
-          <w:p/>
+          <w:p>
+            <w:pPr>
+              <w:rPr>
+                <w:sz w:val="20"/>
+                <w:szCs w:val="20"/>
+              </w:rPr>
+            </w:pPr>
+            <w:r>
+              <w:rPr>
+                <w:sz w:val="20"/>
+                <w:szCs w:val="20"/>
+              </w:rPr>
+              <w:t>I think it is very convenient and easy to use, I think I like the pen, I don’t have to keep grabbing. Well, I can release. For example, if I move for a long distance, I will be more tired, so this is more convenient.</w:t>
+            </w:r>
+          </w:p>
+          <w:p>
+            <w:pPr>
+              <w:rPr>
+                <w:sz w:val="20"/>
+                <w:szCs w:val="20"/>
+              </w:rPr>
+            </w:pPr>
+            <w:r>
+              <w:rPr>
+                <w:sz w:val="20"/>
+                <w:szCs w:val="20"/>
+              </w:rPr>
+              <w:t xml:space="preserve">Hope the pen has an aim. It can be a yellow point </w:t>
+            </w:r>
+            <w:proofErr w:type="gramStart"/>
+            <w:r>
+              <w:rPr>
+                <w:sz w:val="20"/>
+                <w:szCs w:val="20"/>
+              </w:rPr>
+              <w:t>similar to</w:t>
+            </w:r>
+            <w:proofErr w:type="gramEnd"/>
+            <w:r>
+              <w:rPr>
+                <w:sz w:val="20"/>
+                <w:szCs w:val="20"/>
+              </w:rPr>
+              <w:t xml:space="preserve"> the yellow pen, so I can track it, I can clearly see where the next track </w:t>
+            </w:r>
+            <w:r>
+              <w:rPr>
+                <w:sz w:val="20"/>
+                <w:szCs w:val="20"/>
+              </w:rPr>
+              <w:t>will be</w:t>
+            </w:r>
+            <w:r>
+              <w:rPr>
+                <w:sz w:val="20"/>
+                <w:szCs w:val="20"/>
+              </w:rPr>
+              <w:t>.</w:t>
+            </w:r>
+          </w:p>
         </w:tc>
       </w:tr>
     </w:tbl>
+    <w:p>
+      <w:r>
+        <w:t>Participant 4</w:t>
+      </w:r>
+    </w:p>
     <w:p/>
     <w:p>
       <w:r>
         <w:t>Overall satisfactory? (1-5)</w:t>
       </w:r>
+      <w:r>
+        <w:t xml:space="preserve"> 4.5</w:t>
+      </w:r>
     </w:p>
+    <w:p/>
+    <w:p/>
+    <w:p/>
+    <w:p/>
+    <w:p/>
+    <w:p/>
+    <w:p/>
+    <w:p/>
+    <w:p/>
+    <w:p/>
     <w:p/>
     <w:p>
       <w:r>
+        <w:lastRenderedPageBreak/>
         <w:t>Participant 5</w:t>
       </w:r>
     </w:p>
     <w:tbl>
       <w:tblPr>
         <w:tblStyle w:val="TableGrid"/>
-        <w:tblpPr w:leftFromText="180" w:rightFromText="180" w:vertAnchor="page" w:horzAnchor="margin" w:tblpY="6734"/>
+        <w:tblpPr w:leftFromText="180" w:rightFromText="180" w:vertAnchor="page" w:horzAnchor="margin" w:tblpY="1986"/>
         <w:tblW w:w="0" w:type="auto"/>
         <w:tblLook w:val="04A0" w:firstRow="1" w:lastRow="0" w:firstColumn="1" w:lastColumn="0" w:noHBand="0" w:noVBand="1"/>
       </w:tblPr>
@@ -2267,6 +2946,15 @@
             <w:pPr>
               <w:jc w:val="center"/>
             </w:pPr>
+            <w:r>
+              <w:t>20</w:t>
+            </w:r>
+            <w:r>
+              <w:rPr>
+                <w:rFonts w:hint="eastAsia"/>
+              </w:rPr>
+              <w:t>s</w:t>
+            </w:r>
           </w:p>
         </w:tc>
         <w:tc>
@@ -2286,7 +2974,23 @@
           <w:tcPr>
             <w:tcW w:w="4059" w:type="dxa"/>
           </w:tcPr>
-          <w:p/>
+          <w:p>
+            <w:pPr>
+              <w:rPr>
+                <w:rFonts w:ascii="Arial" w:hAnsi="Arial" w:cs="Arial"/>
+                <w:sz w:val="20"/>
+                <w:szCs w:val="20"/>
+              </w:rPr>
+            </w:pPr>
+            <w:r>
+              <w:rPr>
+                <w:rFonts w:ascii="Arial" w:hAnsi="Arial" w:cs="Arial"/>
+                <w:sz w:val="20"/>
+                <w:szCs w:val="20"/>
+              </w:rPr>
+              <w:t>/</w:t>
+            </w:r>
+          </w:p>
         </w:tc>
       </w:tr>
       <w:tr>
@@ -2311,6 +3015,9 @@
             <w:pPr>
               <w:jc w:val="center"/>
             </w:pPr>
+            <w:r>
+              <w:t>42s</w:t>
+            </w:r>
           </w:p>
         </w:tc>
         <w:tc>
@@ -2330,7 +3037,23 @@
           <w:tcPr>
             <w:tcW w:w="4059" w:type="dxa"/>
           </w:tcPr>
-          <w:p/>
+          <w:p>
+            <w:pPr>
+              <w:rPr>
+                <w:rFonts w:ascii="Arial" w:hAnsi="Arial" w:cs="Arial"/>
+                <w:sz w:val="20"/>
+                <w:szCs w:val="20"/>
+              </w:rPr>
+            </w:pPr>
+            <w:r>
+              <w:rPr>
+                <w:rFonts w:ascii="Arial" w:hAnsi="Arial" w:cs="Arial"/>
+                <w:sz w:val="20"/>
+                <w:szCs w:val="20"/>
+              </w:rPr>
+              <w:t>Drawing is quite intuitive, though the pen tip seems a bit offset from where I expect it to be.</w:t>
+            </w:r>
+          </w:p>
         </w:tc>
       </w:tr>
       <w:tr>
@@ -2355,6 +3078,9 @@
             <w:pPr>
               <w:jc w:val="center"/>
             </w:pPr>
+            <w:r>
+              <w:t>16s</w:t>
+            </w:r>
           </w:p>
         </w:tc>
         <w:tc>
@@ -2374,7 +3100,24 @@
           <w:tcPr>
             <w:tcW w:w="4059" w:type="dxa"/>
           </w:tcPr>
-          <w:p/>
+          <w:p>
+            <w:pPr>
+              <w:rPr>
+                <w:rFonts w:ascii="Arial" w:hAnsi="Arial" w:cs="Arial"/>
+                <w:sz w:val="20"/>
+                <w:szCs w:val="20"/>
+              </w:rPr>
+            </w:pPr>
+            <w:r>
+              <w:rPr>
+                <w:rFonts w:ascii="Arial" w:hAnsi="Arial" w:cs="Arial"/>
+                <w:color w:val="000000"/>
+                <w:sz w:val="20"/>
+                <w:szCs w:val="20"/>
+              </w:rPr>
+              <w:t>Eraser works well, good size for precision erasing.</w:t>
+            </w:r>
+          </w:p>
         </w:tc>
       </w:tr>
       <w:tr>
@@ -2399,6 +3142,9 @@
             <w:pPr>
               <w:jc w:val="center"/>
             </w:pPr>
+            <w:r>
+              <w:t>22s</w:t>
+            </w:r>
           </w:p>
         </w:tc>
         <w:tc>
@@ -2418,7 +3164,24 @@
           <w:tcPr>
             <w:tcW w:w="4059" w:type="dxa"/>
           </w:tcPr>
-          <w:p/>
+          <w:p>
+            <w:pPr>
+              <w:rPr>
+                <w:rFonts w:ascii="Arial" w:hAnsi="Arial" w:cs="Arial"/>
+                <w:sz w:val="20"/>
+                <w:szCs w:val="20"/>
+              </w:rPr>
+            </w:pPr>
+            <w:r>
+              <w:rPr>
+                <w:rFonts w:ascii="Arial" w:hAnsi="Arial" w:cs="Arial"/>
+                <w:color w:val="000000"/>
+                <w:sz w:val="20"/>
+                <w:szCs w:val="20"/>
+              </w:rPr>
+              <w:t>Very convenient.</w:t>
+            </w:r>
+          </w:p>
         </w:tc>
       </w:tr>
       <w:tr>
@@ -2443,6 +3206,9 @@
             <w:pPr>
               <w:jc w:val="center"/>
             </w:pPr>
+            <w:r>
+              <w:t>28s</w:t>
+            </w:r>
           </w:p>
         </w:tc>
         <w:tc>
@@ -2462,7 +3228,24 @@
           <w:tcPr>
             <w:tcW w:w="4059" w:type="dxa"/>
           </w:tcPr>
-          <w:p/>
+          <w:p>
+            <w:pPr>
+              <w:rPr>
+                <w:rFonts w:ascii="Arial" w:hAnsi="Arial" w:cs="Arial"/>
+                <w:sz w:val="20"/>
+                <w:szCs w:val="20"/>
+              </w:rPr>
+            </w:pPr>
+            <w:r>
+              <w:rPr>
+                <w:rFonts w:ascii="Arial" w:hAnsi="Arial" w:cs="Arial"/>
+                <w:color w:val="000000"/>
+                <w:sz w:val="20"/>
+                <w:szCs w:val="20"/>
+              </w:rPr>
+              <w:t>Scaling is smooth and natural. Two-handed interaction feels good.</w:t>
+            </w:r>
+          </w:p>
         </w:tc>
       </w:tr>
       <w:tr>
@@ -2487,6 +3270,9 @@
             <w:pPr>
               <w:jc w:val="center"/>
             </w:pPr>
+            <w:r>
+              <w:t>18s</w:t>
+            </w:r>
           </w:p>
         </w:tc>
         <w:tc>
@@ -2506,7 +3292,24 @@
           <w:tcPr>
             <w:tcW w:w="4059" w:type="dxa"/>
           </w:tcPr>
-          <w:p/>
+          <w:p>
+            <w:pPr>
+              <w:rPr>
+                <w:rFonts w:ascii="Arial" w:hAnsi="Arial" w:cs="Arial"/>
+                <w:sz w:val="20"/>
+                <w:szCs w:val="20"/>
+              </w:rPr>
+            </w:pPr>
+            <w:r>
+              <w:rPr>
+                <w:rFonts w:ascii="Arial" w:hAnsi="Arial" w:cs="Arial"/>
+                <w:color w:val="000000"/>
+                <w:sz w:val="20"/>
+                <w:szCs w:val="20"/>
+              </w:rPr>
+              <w:t>Moving canvas is easy.</w:t>
+            </w:r>
+          </w:p>
         </w:tc>
       </w:tr>
       <w:tr>
@@ -2531,6 +3334,9 @@
             <w:pPr>
               <w:jc w:val="center"/>
             </w:pPr>
+            <w:r>
+              <w:t>~</w:t>
+            </w:r>
           </w:p>
         </w:tc>
         <w:tc>
@@ -2550,7 +3356,24 @@
           <w:tcPr>
             <w:tcW w:w="4059" w:type="dxa"/>
           </w:tcPr>
-          <w:p/>
+          <w:p>
+            <w:pPr>
+              <w:rPr>
+                <w:rFonts w:ascii="Arial" w:hAnsi="Arial" w:cs="Arial"/>
+                <w:sz w:val="20"/>
+                <w:szCs w:val="20"/>
+              </w:rPr>
+            </w:pPr>
+            <w:r>
+              <w:rPr>
+                <w:rFonts w:ascii="Arial" w:hAnsi="Arial" w:cs="Arial"/>
+                <w:color w:val="000000"/>
+                <w:sz w:val="20"/>
+                <w:szCs w:val="20"/>
+              </w:rPr>
+              <w:t>Overall, the experience is quite polished. One suggestion, maybe add some haptic feedback when the pen touches the canvas, so I know I'm making contact.</w:t>
+            </w:r>
+          </w:p>
         </w:tc>
       </w:tr>
     </w:tbl>
@@ -2559,9 +3382,10 @@
       <w:r>
         <w:t>Overall satisfactory? (1-5)</w:t>
       </w:r>
+      <w:r>
+        <w:t xml:space="preserve"> 4</w:t>
+      </w:r>
     </w:p>
-    <w:p/>
-    <w:p/>
     <w:p/>
     <w:p/>
     <w:p/>

</xml_diff>